<commit_message>
Commit 2. Ampliación de Collab
nuevamente abordamos el tema de tensores en collab
</commit_message>
<xml_diff>
--- a/Novena semana de Técnicas de Inteligencia Artificial.docx
+++ b/Novena semana de Técnicas de Inteligencia Artificial.docx
@@ -47,7 +47,49 @@
         <w:rPr>
           <w:rtl w:val="0"/>
         </w:rPr>
-        <w:t xml:space="preserve"> El día martes 20 de octubre el profesor nos enseñó a codificar en google collab unos tensores para dibujar algunas matrices en pantalla.</w:t>
+        <w:t xml:space="preserve"> El día lunes 19 de octubre el profesor nos enseñó a codificar en google collab unos tensores para dibujar algunas matrices en pantalla.</w:t>
+      </w:r>
+    </w:p>
+    <w:p>
+      <w:pPr>
+        <w:rPr/>
+      </w:pPr>
+      <w:r>
+        <w:rPr>
+          <w:rtl w:val="0"/>
+        </w:rPr>
+      </w:r>
+    </w:p>
+    <w:p>
+      <w:pPr>
+        <w:rPr/>
+      </w:pPr>
+      <w:r>
+        <w:rPr>
+          <w:b w:val="1"/>
+          <w:bCs w:val="1"/>
+          <w:rtl w:val="0"/>
+        </w:rPr>
+        <w:t xml:space="preserve">Actividad 2: </w:t>
+      </w:r>
+      <w:r>
+        <w:rPr>
+          <w:rtl w:val="0"/>
+        </w:rPr>
+        <w:t xml:space="preserve">El día martes 20 de octubre continuamos con los tensores que se vieron el día anterior.</w:t>
+      </w:r>
+    </w:p>
+    <w:p>
+      <w:pPr>
+        <w:rPr>
+          <w:b w:val="1"/>
+          <w:bCs w:val="1"/>
+        </w:rPr>
+      </w:pPr>
+      <w:r>
+        <w:rPr>
+          <w:rtl w:val="0"/>
+        </w:rPr>
       </w:r>
     </w:p>
     <w:p>

</xml_diff>

<commit_message>
Commit 3. Cambio de dron
compre un nuevo dron en Amazon y ando esperando a que llegue
</commit_message>
<xml_diff>
--- a/Novena semana de Técnicas de Inteligencia Artificial.docx
+++ b/Novena semana de Técnicas de Inteligencia Artificial.docx
@@ -90,6 +90,25 @@
         <w:rPr>
           <w:rtl w:val="0"/>
         </w:rPr>
+      </w:r>
+    </w:p>
+    <w:p>
+      <w:pPr>
+        <w:rPr/>
+      </w:pPr>
+      <w:r>
+        <w:rPr>
+          <w:b w:val="1"/>
+          <w:bCs w:val="1"/>
+          <w:rtl w:val="0"/>
+        </w:rPr>
+        <w:t xml:space="preserve">Actividad 3: </w:t>
+      </w:r>
+      <w:r>
+        <w:rPr>
+          <w:rtl w:val="0"/>
+        </w:rPr>
+        <w:t xml:space="preserve">el día Jueves 22 de octubre se tomó la decisión de comprar un nuevo dron, y de momento estamos en la espera de que llegue.</w:t>
       </w:r>
     </w:p>
     <w:p>

</xml_diff>